<commit_message>
Thực hành 1: Tạo dự án khởi động RNStarter và hoàn thiện báo cáo
</commit_message>
<xml_diff>
--- a/Luyện tập 1/BuiDuyThanh_LuyenTap1.docx
+++ b/Luyện tập 1/BuiDuyThanh_LuyenTap1.docx
@@ -2864,6 +2864,91 @@
           <w:sz w:val="24"/>
         </w:rPr>
         <w:t>Với người mới bắt đầu học hoặc cần làm project nhanh có thể bắt đầu với Expo. Khi dự án yêu cầu kiểm soát sâu native hoặc tích hợp phức tạp, có thể chọn React Native Community CLI hoặc chuyển sang cấu hình có native project phù hợp.</w:t>
+      </w:r>
+    </w:p>
+    <w:p>
+      <w:r>
+        <w:rPr>
+          <w:b/>
+          <w:sz w:val="28"/>
+        </w:rPr>
+        <w:t>Thực hành 1 – Tạo app khởi động (RNStarter)</w:t>
+      </w:r>
+    </w:p>
+    <w:p>
+      <w:r>
+        <w:t>1. Mục tiêu: Tạo được project bằng Expo, chạy trên thiết bị và chỉnh sửa màn hình đầu tiên để quan sát tính năng Fast Refresh / Hot Reload.</w:t>
+      </w:r>
+    </w:p>
+    <w:p>
+      <w:r>
+        <w:t>2. Lệnh thực hiện:</w:t>
+      </w:r>
+    </w:p>
+    <w:p>
+      <w:r>
+        <w:t xml:space="preserve">   • Khởi tạo dự án: npx create-expo-app RNStarter</w:t>
+      </w:r>
+    </w:p>
+    <w:p>
+      <w:r>
+        <w:t xml:space="preserve">   • Khởi chạy dự án: cd RNStarter &amp;&amp; npx expo start</w:t>
+      </w:r>
+    </w:p>
+    <w:p>
+      <w:r>
+        <w:t>3. Kết quả chạy thực tế trên thiết bị:</w:t>
+      </w:r>
+    </w:p>
+    <w:p>
+      <w:pPr>
+        <w:jc w:val="center"/>
+      </w:pPr>
+      <w:r>
+        <w:drawing>
+          <wp:inline xmlns:a="http://schemas.openxmlformats.org/drawingml/2006/main" xmlns:pic="http://schemas.openxmlformats.org/drawingml/2006/picture">
+            <wp:extent cx="2560320" cy="5554593"/>
+            <wp:docPr id="1" name="Picture 1"/>
+            <wp:cNvGraphicFramePr>
+              <a:graphicFrameLocks noChangeAspect="1"/>
+            </wp:cNvGraphicFramePr>
+            <a:graphic>
+              <a:graphicData uri="http://schemas.openxmlformats.org/drawingml/2006/picture">
+                <pic:pic>
+                  <pic:nvPicPr>
+                    <pic:cNvPr id="0" name="screenshot_buoi1.png"/>
+                    <pic:cNvPicPr/>
+                  </pic:nvPicPr>
+                  <pic:blipFill>
+                    <a:blip r:embed="rId8"/>
+                    <a:stretch>
+                      <a:fillRect/>
+                    </a:stretch>
+                  </pic:blipFill>
+                  <pic:spPr>
+                    <a:xfrm>
+                      <a:off x="0" y="0"/>
+                      <a:ext cx="2560320" cy="5554593"/>
+                    </a:xfrm>
+                    <a:prstGeom prst="rect"/>
+                  </pic:spPr>
+                </pic:pic>
+              </a:graphicData>
+            </a:graphic>
+          </wp:inline>
+        </w:drawing>
+      </w:r>
+    </w:p>
+    <w:p>
+      <w:pPr>
+        <w:jc w:val="center"/>
+      </w:pPr>
+      <w:r>
+        <w:rPr>
+          <w:i/>
+          <w:sz w:val="20"/>
+        </w:rPr>
+        <w:t>Hình 1: Ứng dụng RNStarter chạy thành công trên thiết bị di động (Hot Reload hiển thị thông điệp Hello React Native!)</w:t>
       </w:r>
     </w:p>
     <w:sectPr>

</xml_diff>